<commit_message>
changed formatting in contact list
</commit_message>
<xml_diff>
--- a/Forventninger-til-og-mål-med-projektet.docx
+++ b/Forventninger-til-og-mål-med-projektet.docx
@@ -59,7 +59,15 @@
         </w:numPr>
       </w:pPr>
       <w:r>
-        <w:t>Hvad motiverer den enkelte i gruppen til gøre en indsats?</w:t>
+        <w:t xml:space="preserve">Hvad motiverer den enkelte i gruppen til </w:t>
+      </w:r>
+      <w:proofErr w:type="gramStart"/>
+      <w:r>
+        <w:t>gøre</w:t>
+      </w:r>
+      <w:proofErr w:type="gramEnd"/>
+      <w:r>
+        <w:t xml:space="preserve"> en indsats?</w:t>
       </w:r>
     </w:p>
     <w:p>
@@ -512,7 +520,162 @@
         </w:numPr>
       </w:pPr>
       <w:r>
-        <w:t>XXXXXXX</w:t>
+        <w:t xml:space="preserve">Jeppe </w:t>
+      </w:r>
+      <w:r>
+        <w:t>Hagelskjær</w:t>
+      </w:r>
+    </w:p>
+    <w:p>
+      <w:pPr>
+        <w:pStyle w:val="Listeafsnit"/>
+        <w:numPr>
+          <w:ilvl w:val="1"/>
+          <w:numId w:val="3"/>
+        </w:numPr>
+      </w:pPr>
+      <w:hyperlink r:id="rId5" w:history="1">
+        <w:r>
+          <w:rPr>
+            <w:rStyle w:val="Hyperlink"/>
+          </w:rPr>
+          <w:t>Jehag25@student.sdu.dk</w:t>
+        </w:r>
+      </w:hyperlink>
+    </w:p>
+    <w:p>
+      <w:pPr>
+        <w:pStyle w:val="Listeafsnit"/>
+        <w:numPr>
+          <w:ilvl w:val="1"/>
+          <w:numId w:val="3"/>
+        </w:numPr>
+      </w:pPr>
+      <w:r>
+        <w:t>21220634</w:t>
+      </w:r>
+    </w:p>
+    <w:p>
+      <w:pPr>
+        <w:pStyle w:val="Listeafsnit"/>
+        <w:numPr>
+          <w:ilvl w:val="0"/>
+          <w:numId w:val="3"/>
+        </w:numPr>
+      </w:pPr>
+      <w:r>
+        <w:t xml:space="preserve">Nick Tran </w:t>
+      </w:r>
+    </w:p>
+    <w:p>
+      <w:pPr>
+        <w:pStyle w:val="Listeafsnit"/>
+        <w:numPr>
+          <w:ilvl w:val="1"/>
+          <w:numId w:val="3"/>
+        </w:numPr>
+      </w:pPr>
+      <w:hyperlink r:id="rId6" w:history="1">
+        <w:r>
+          <w:rPr>
+            <w:rStyle w:val="Hyperlink"/>
+          </w:rPr>
+          <w:t>Nitra26@student.sdu.dk</w:t>
+        </w:r>
+      </w:hyperlink>
+    </w:p>
+    <w:p>
+      <w:pPr>
+        <w:pStyle w:val="Listeafsnit"/>
+        <w:numPr>
+          <w:ilvl w:val="1"/>
+          <w:numId w:val="3"/>
+        </w:numPr>
+      </w:pPr>
+      <w:r>
+        <w:t>42178834</w:t>
+      </w:r>
+    </w:p>
+    <w:p>
+      <w:pPr>
+        <w:pStyle w:val="Listeafsnit"/>
+        <w:numPr>
+          <w:ilvl w:val="0"/>
+          <w:numId w:val="3"/>
+        </w:numPr>
+      </w:pPr>
+      <w:r>
+        <w:t>Nikolaj Olesen</w:t>
+      </w:r>
+    </w:p>
+    <w:p>
+      <w:pPr>
+        <w:pStyle w:val="Listeafsnit"/>
+        <w:numPr>
+          <w:ilvl w:val="1"/>
+          <w:numId w:val="3"/>
+        </w:numPr>
+      </w:pPr>
+      <w:hyperlink r:id="rId7" w:history="1">
+        <w:r>
+          <w:rPr>
+            <w:rStyle w:val="Hyperlink"/>
+          </w:rPr>
+          <w:t>niole26@student.sdu.dk</w:t>
+        </w:r>
+      </w:hyperlink>
+    </w:p>
+    <w:p>
+      <w:pPr>
+        <w:pStyle w:val="Listeafsnit"/>
+        <w:numPr>
+          <w:ilvl w:val="1"/>
+          <w:numId w:val="3"/>
+        </w:numPr>
+      </w:pPr>
+      <w:r>
+        <w:t>51939097</w:t>
+      </w:r>
+    </w:p>
+    <w:p>
+      <w:pPr>
+        <w:pStyle w:val="Listeafsnit"/>
+        <w:numPr>
+          <w:ilvl w:val="0"/>
+          <w:numId w:val="3"/>
+        </w:numPr>
+      </w:pPr>
+      <w:r>
+        <w:t>Steven Nguyen</w:t>
+      </w:r>
+    </w:p>
+    <w:p>
+      <w:pPr>
+        <w:pStyle w:val="Listeafsnit"/>
+        <w:numPr>
+          <w:ilvl w:val="1"/>
+          <w:numId w:val="3"/>
+        </w:numPr>
+      </w:pPr>
+      <w:hyperlink r:id="rId8" w:history="1">
+        <w:r>
+          <w:rPr>
+            <w:rStyle w:val="Hyperlink"/>
+          </w:rPr>
+          <w:t>Stngu26@student.sdu.dk</w:t>
+        </w:r>
+      </w:hyperlink>
+    </w:p>
+    <w:p>
+      <w:pPr>
+        <w:pStyle w:val="Listeafsnit"/>
+        <w:numPr>
+          <w:ilvl w:val="1"/>
+          <w:numId w:val="3"/>
+        </w:numPr>
+      </w:pPr>
+      <w:r>
+        <w:t>50161323</w:t>
       </w:r>
     </w:p>
     <w:p/>
@@ -548,7 +711,7 @@
           <w:szCs w:val="28"/>
         </w:rPr>
       </w:pPr>
-      <w:hyperlink r:id="rId5" w:history="1">
+      <w:hyperlink r:id="rId9" w:history="1">
         <w:r>
           <w:rPr>
             <w:rStyle w:val="Hyperlink"/>
@@ -575,173 +738,6 @@
           <w:rFonts w:cs="Calibri"/>
         </w:rPr>
         <w:t>22102220</w:t>
-      </w:r>
-    </w:p>
-    <w:p>
-      <w:pPr>
-        <w:pStyle w:val="Listeafsnit"/>
-        <w:numPr>
-          <w:ilvl w:val="0"/>
-          <w:numId w:val="3"/>
-        </w:numPr>
-      </w:pPr>
-      <w:r>
-        <w:t xml:space="preserve">Jeppe </w:t>
-      </w:r>
-      <w:r>
-        <w:t>Hagelskjær</w:t>
-      </w:r>
-    </w:p>
-    <w:p>
-      <w:pPr>
-        <w:pStyle w:val="Listeafsnit"/>
-        <w:numPr>
-          <w:ilvl w:val="1"/>
-          <w:numId w:val="3"/>
-        </w:numPr>
-      </w:pPr>
-      <w:hyperlink r:id="rId6" w:history="1">
-        <w:r>
-          <w:rPr>
-            <w:rStyle w:val="Hyperlink"/>
-          </w:rPr>
-          <w:t>Jehag25@student.sdu.dk</w:t>
-        </w:r>
-      </w:hyperlink>
-    </w:p>
-    <w:p>
-      <w:pPr>
-        <w:pStyle w:val="Listeafsnit"/>
-        <w:numPr>
-          <w:ilvl w:val="1"/>
-          <w:numId w:val="3"/>
-        </w:numPr>
-      </w:pPr>
-      <w:r>
-        <w:t>21220634</w:t>
-      </w:r>
-    </w:p>
-    <w:p>
-      <w:pPr>
-        <w:pStyle w:val="Listeafsnit"/>
-        <w:numPr>
-          <w:ilvl w:val="0"/>
-          <w:numId w:val="3"/>
-        </w:numPr>
-      </w:pPr>
-      <w:r>
-        <w:t xml:space="preserve">Nick Tran </w:t>
-      </w:r>
-    </w:p>
-    <w:p>
-      <w:pPr>
-        <w:pStyle w:val="Listeafsnit"/>
-        <w:numPr>
-          <w:ilvl w:val="1"/>
-          <w:numId w:val="3"/>
-        </w:numPr>
-      </w:pPr>
-      <w:hyperlink r:id="rId7" w:history="1">
-        <w:r>
-          <w:rPr>
-            <w:rStyle w:val="Hyperlink"/>
-          </w:rPr>
-          <w:t>Nitra26@student.sdu.dk</w:t>
-        </w:r>
-      </w:hyperlink>
-    </w:p>
-    <w:p>
-      <w:pPr>
-        <w:pStyle w:val="Listeafsnit"/>
-        <w:numPr>
-          <w:ilvl w:val="1"/>
-          <w:numId w:val="3"/>
-        </w:numPr>
-      </w:pPr>
-      <w:r>
-        <w:t>42178834</w:t>
-      </w:r>
-    </w:p>
-    <w:p>
-      <w:pPr>
-        <w:pStyle w:val="Listeafsnit"/>
-        <w:numPr>
-          <w:ilvl w:val="0"/>
-          <w:numId w:val="3"/>
-        </w:numPr>
-      </w:pPr>
-      <w:r>
-        <w:t>Nikolaj Olesen</w:t>
-      </w:r>
-    </w:p>
-    <w:p>
-      <w:pPr>
-        <w:pStyle w:val="Listeafsnit"/>
-        <w:numPr>
-          <w:ilvl w:val="1"/>
-          <w:numId w:val="3"/>
-        </w:numPr>
-      </w:pPr>
-      <w:hyperlink r:id="rId8" w:history="1">
-        <w:r>
-          <w:rPr>
-            <w:rStyle w:val="Hyperlink"/>
-          </w:rPr>
-          <w:t>niole26@student.sdu.dk</w:t>
-        </w:r>
-      </w:hyperlink>
-    </w:p>
-    <w:p>
-      <w:pPr>
-        <w:pStyle w:val="Listeafsnit"/>
-        <w:numPr>
-          <w:ilvl w:val="1"/>
-          <w:numId w:val="3"/>
-        </w:numPr>
-      </w:pPr>
-      <w:r>
-        <w:t>51939097</w:t>
-      </w:r>
-    </w:p>
-    <w:p>
-      <w:pPr>
-        <w:pStyle w:val="Listeafsnit"/>
-        <w:numPr>
-          <w:ilvl w:val="0"/>
-          <w:numId w:val="3"/>
-        </w:numPr>
-      </w:pPr>
-      <w:r>
-        <w:t>Steven Nguyen</w:t>
-      </w:r>
-    </w:p>
-    <w:p>
-      <w:pPr>
-        <w:pStyle w:val="Listeafsnit"/>
-        <w:numPr>
-          <w:ilvl w:val="1"/>
-          <w:numId w:val="3"/>
-        </w:numPr>
-      </w:pPr>
-      <w:hyperlink r:id="rId9" w:history="1">
-        <w:r>
-          <w:rPr>
-            <w:rStyle w:val="Hyperlink"/>
-          </w:rPr>
-          <w:t>Stngu26@student.sdu.dk</w:t>
-        </w:r>
-      </w:hyperlink>
-    </w:p>
-    <w:p>
-      <w:pPr>
-        <w:pStyle w:val="Listeafsnit"/>
-        <w:numPr>
-          <w:ilvl w:val="1"/>
-          <w:numId w:val="3"/>
-        </w:numPr>
-      </w:pPr>
-      <w:r>
-        <w:t>50161323</w:t>
       </w:r>
     </w:p>
     <w:p/>

</xml_diff>

<commit_message>
Added tuesday 22nd september Vejledningsaftale update and Samarbejdsaftale (new name) update
</commit_message>
<xml_diff>
--- a/Forventninger-til-og-mål-med-projektet.docx
+++ b/Forventninger-til-og-mål-med-projektet.docx
@@ -23,7 +23,73 @@
         </w:numPr>
       </w:pPr>
       <w:r>
-        <w:t>Vi forventer at alle leverer en engageret indsats.</w:t>
+        <w:t>Vi forventer at alle leverer en engageret indsats</w:t>
+      </w:r>
+      <w:r>
+        <w:t>.</w:t>
+      </w:r>
+    </w:p>
+    <w:p>
+      <w:pPr>
+        <w:pStyle w:val="Listeafsnit"/>
+        <w:numPr>
+          <w:ilvl w:val="1"/>
+          <w:numId w:val="3"/>
+        </w:numPr>
+      </w:pPr>
+      <w:r>
+        <w:t>Faglig forventning</w:t>
+      </w:r>
+    </w:p>
+    <w:p>
+      <w:pPr>
+        <w:pStyle w:val="Listeafsnit"/>
+        <w:numPr>
+          <w:ilvl w:val="2"/>
+          <w:numId w:val="3"/>
+        </w:numPr>
+      </w:pPr>
+      <w:r>
+        <w:t xml:space="preserve">Arbejdstid: </w:t>
+      </w:r>
+      <w:r>
+        <w:t>10</w:t>
+      </w:r>
+      <w:r>
+        <w:t xml:space="preserve"> timer pr uge</w:t>
+      </w:r>
+      <w:r>
+        <w:t>, herunder</w:t>
+      </w:r>
+      <w:r>
+        <w:t xml:space="preserve"> inkluderes</w:t>
+      </w:r>
+      <w:r>
+        <w:t xml:space="preserve"> hjemmearbejde.</w:t>
+      </w:r>
+    </w:p>
+    <w:p>
+      <w:pPr>
+        <w:pStyle w:val="Listeafsnit"/>
+        <w:numPr>
+          <w:ilvl w:val="1"/>
+          <w:numId w:val="3"/>
+        </w:numPr>
+      </w:pPr>
+      <w:r>
+        <w:t>Social forventning</w:t>
+      </w:r>
+    </w:p>
+    <w:p>
+      <w:pPr>
+        <w:pStyle w:val="Listeafsnit"/>
+        <w:numPr>
+          <w:ilvl w:val="2"/>
+          <w:numId w:val="3"/>
+        </w:numPr>
+      </w:pPr>
+      <w:r>
+        <w:t>Fremmøde til aftalt gruppearbejde</w:t>
       </w:r>
     </w:p>
     <w:p>
@@ -42,14 +108,143 @@
       <w:pPr>
         <w:pStyle w:val="Listeafsnit"/>
         <w:numPr>
+          <w:ilvl w:val="1"/>
+          <w:numId w:val="3"/>
+        </w:numPr>
+      </w:pPr>
+      <w:r>
+        <w:t>Vi overholder afleveringsfrister</w:t>
+      </w:r>
+      <w:r>
+        <w:t xml:space="preserve"> og at gruppen består projektforløbet</w:t>
+      </w:r>
+    </w:p>
+    <w:p/>
+    <w:p>
+      <w:pPr>
+        <w:pStyle w:val="Listeafsnit"/>
+        <w:numPr>
+          <w:ilvl w:val="1"/>
+          <w:numId w:val="1"/>
+        </w:numPr>
+      </w:pPr>
+      <w:r>
+        <w:t xml:space="preserve">Hvad motiverer den enkelte i gruppen til </w:t>
+      </w:r>
+      <w:r>
+        <w:t>at gøre</w:t>
+      </w:r>
+      <w:r>
+        <w:t xml:space="preserve"> en indsats?</w:t>
+      </w:r>
+    </w:p>
+    <w:p>
+      <w:pPr>
+        <w:pStyle w:val="Listeafsnit"/>
+        <w:numPr>
           <w:ilvl w:val="0"/>
           <w:numId w:val="3"/>
         </w:numPr>
       </w:pPr>
       <w:r>
+        <w:t>Pligt og ansvar overfor resten af gruppen</w:t>
+      </w:r>
+    </w:p>
+    <w:p>
+      <w:pPr>
+        <w:pStyle w:val="Listeafsnit"/>
+        <w:numPr>
+          <w:ilvl w:val="0"/>
+          <w:numId w:val="3"/>
+        </w:numPr>
+      </w:pPr>
+      <w:r>
+        <w:t xml:space="preserve">Læring </w:t>
+      </w:r>
+      <w:r>
+        <w:sym w:font="Wingdings" w:char="F0E0"/>
+      </w:r>
+      <w:r>
+        <w:t xml:space="preserve"> teori og praksis i arbejde med projekter og i grupper?</w:t>
+      </w:r>
+    </w:p>
+    <w:p/>
+    <w:p>
+      <w:pPr>
+        <w:pStyle w:val="Listeafsnit"/>
+        <w:numPr>
+          <w:ilvl w:val="1"/>
+          <w:numId w:val="1"/>
+        </w:numPr>
+      </w:pPr>
+      <w:r>
+        <w:t>Arbejdstider</w:t>
+      </w:r>
+    </w:p>
+    <w:p>
+      <w:pPr>
+        <w:pStyle w:val="Listeafsnit"/>
+        <w:numPr>
+          <w:ilvl w:val="0"/>
+          <w:numId w:val="3"/>
+        </w:numPr>
+      </w:pPr>
+      <w:r>
+        <w:t xml:space="preserve">Tirsdag vejledningsmøde kl. 8:00 </w:t>
+      </w:r>
+      <w:r>
+        <w:t>–</w:t>
+      </w:r>
+      <w:r>
         <w:t xml:space="preserve"> </w:t>
       </w:r>
-    </w:p>
+      <w:r>
+        <w:t xml:space="preserve">8:45, herefter </w:t>
+      </w:r>
+      <w:r>
+        <w:t>benytt</w:t>
+      </w:r>
+      <w:r>
+        <w:t xml:space="preserve">er </w:t>
+      </w:r>
+      <w:r>
+        <w:t xml:space="preserve">skemaplanlagt gruppearbejdstid indtil kl. 13:59, </w:t>
+      </w:r>
+      <w:r>
+        <w:t>over</w:t>
+      </w:r>
+      <w:r>
+        <w:t xml:space="preserve">arbejder </w:t>
+      </w:r>
+      <w:r>
+        <w:t xml:space="preserve">kan forekomme afhængigt af </w:t>
+      </w:r>
+      <w:r>
+        <w:t>hvor vi er i processen og omstændighederne</w:t>
+      </w:r>
+      <w:r>
+        <w:t>, visa versa kan tidligt fri også forekomme</w:t>
+      </w:r>
+      <w:r>
+        <w:t>. (Fleksibilitet</w:t>
+      </w:r>
+      <w:r>
+        <w:t>!)</w:t>
+      </w:r>
+    </w:p>
+    <w:p>
+      <w:pPr>
+        <w:pStyle w:val="Listeafsnit"/>
+        <w:numPr>
+          <w:ilvl w:val="0"/>
+          <w:numId w:val="3"/>
+        </w:numPr>
+      </w:pPr>
+      <w:r>
+        <w:t>Torsdag 12 – 16 (15)</w:t>
+      </w:r>
+    </w:p>
+    <w:p/>
     <w:p>
       <w:pPr>
         <w:pStyle w:val="Listeafsnit"/>
@@ -59,15 +254,7 @@
         </w:numPr>
       </w:pPr>
       <w:r>
-        <w:t xml:space="preserve">Hvad motiverer den enkelte i gruppen til </w:t>
-      </w:r>
-      <w:proofErr w:type="gramStart"/>
-      <w:r>
-        <w:t>gøre</w:t>
-      </w:r>
-      <w:proofErr w:type="gramEnd"/>
-      <w:r>
-        <w:t xml:space="preserve"> en indsats?</w:t>
+        <w:t>Gruppemøder</w:t>
       </w:r>
     </w:p>
     <w:p>
@@ -79,7 +266,67 @@
         </w:numPr>
       </w:pPr>
       <w:r>
-        <w:t>Pligt og ansvar overfor resten af gruppen</w:t>
+        <w:t>Der skal til gruppemøder være følgende roller:</w:t>
+      </w:r>
+    </w:p>
+    <w:p>
+      <w:pPr>
+        <w:pStyle w:val="Listeafsnit"/>
+        <w:numPr>
+          <w:ilvl w:val="1"/>
+          <w:numId w:val="3"/>
+        </w:numPr>
+      </w:pPr>
+      <w:r>
+        <w:t>Ordstyrer</w:t>
+      </w:r>
+    </w:p>
+    <w:p>
+      <w:pPr>
+        <w:pStyle w:val="Listeafsnit"/>
+        <w:numPr>
+          <w:ilvl w:val="2"/>
+          <w:numId w:val="3"/>
+        </w:numPr>
+      </w:pPr>
+      <w:r>
+        <w:t>Sørger for at agenda bliver overholdt</w:t>
+      </w:r>
+    </w:p>
+    <w:p>
+      <w:pPr>
+        <w:pStyle w:val="Listeafsnit"/>
+        <w:numPr>
+          <w:ilvl w:val="1"/>
+          <w:numId w:val="3"/>
+        </w:numPr>
+      </w:pPr>
+      <w:r>
+        <w:t>Referent</w:t>
+      </w:r>
+    </w:p>
+    <w:p>
+      <w:pPr>
+        <w:pStyle w:val="Listeafsnit"/>
+        <w:numPr>
+          <w:ilvl w:val="2"/>
+          <w:numId w:val="3"/>
+        </w:numPr>
+      </w:pPr>
+      <w:r>
+        <w:t>Skriver logbog, som skal bruges til rapport</w:t>
+      </w:r>
+    </w:p>
+    <w:p>
+      <w:pPr>
+        <w:pStyle w:val="Listeafsnit"/>
+        <w:numPr>
+          <w:ilvl w:val="2"/>
+          <w:numId w:val="3"/>
+        </w:numPr>
+      </w:pPr>
+      <w:r>
+        <w:t>Vigtigste punkter til vejledning</w:t>
       </w:r>
     </w:p>
     <w:p>
@@ -91,13 +338,7 @@
         </w:numPr>
       </w:pPr>
       <w:r>
-        <w:t xml:space="preserve">Læring </w:t>
-      </w:r>
-      <w:r>
-        <w:sym w:font="Wingdings" w:char="F0E0"/>
-      </w:r>
-      <w:r>
-        <w:t xml:space="preserve"> teori og praksis i arbejde med projekter og i grupper?</w:t>
+        <w:t xml:space="preserve">Tirsdag og torsdag </w:t>
       </w:r>
     </w:p>
     <w:p>
@@ -108,7 +349,171 @@
           <w:numId w:val="3"/>
         </w:numPr>
       </w:pPr>
-    </w:p>
+      <w:r>
+        <w:t>Onsdag kan tages i brug ved relevans</w:t>
+      </w:r>
+    </w:p>
+    <w:p>
+      <w:pPr>
+        <w:pStyle w:val="Listeafsnit"/>
+        <w:numPr>
+          <w:ilvl w:val="1"/>
+          <w:numId w:val="3"/>
+        </w:numPr>
+      </w:pPr>
+      <w:r>
+        <w:t xml:space="preserve">Det omfatter ved skriftligt arbejde som </w:t>
+      </w:r>
+      <w:r>
+        <w:t>ikke kan løses på de afsatte dage (Tirsdag og torsdag).</w:t>
+      </w:r>
+    </w:p>
+    <w:p>
+      <w:pPr>
+        <w:pStyle w:val="Listeafsnit"/>
+        <w:numPr>
+          <w:ilvl w:val="1"/>
+          <w:numId w:val="3"/>
+        </w:numPr>
+      </w:pPr>
+      <w:r>
+        <w:t>De sidste 3 uger op til eksamen forventes det</w:t>
+      </w:r>
+      <w:r>
+        <w:t xml:space="preserve"> at onsdagen bliver taget i brug til finpudsning af rapport, spil og forståelse.</w:t>
+      </w:r>
+    </w:p>
+    <w:p>
+      <w:pPr>
+        <w:pStyle w:val="Listeafsnit"/>
+        <w:numPr>
+          <w:ilvl w:val="0"/>
+          <w:numId w:val="3"/>
+        </w:numPr>
+      </w:pPr>
+      <w:r>
+        <w:t>Kommunikation i forhold til fravær og at komme for sent</w:t>
+      </w:r>
+    </w:p>
+    <w:p>
+      <w:pPr>
+        <w:pStyle w:val="Listeafsnit"/>
+        <w:numPr>
+          <w:ilvl w:val="1"/>
+          <w:numId w:val="3"/>
+        </w:numPr>
+      </w:pPr>
+      <w:r>
+        <w:lastRenderedPageBreak/>
+        <w:t xml:space="preserve">Kommunikation </w:t>
+      </w:r>
+      <w:r>
+        <w:t xml:space="preserve">foregår via fællesgruppechat på messenger, der skal meldes afbud ved sygdom og ved forsinkelser, det skal ske </w:t>
+      </w:r>
+      <w:r>
+        <w:t>senest 30 min før aftalt mødetid.</w:t>
+      </w:r>
+    </w:p>
+    <w:p>
+      <w:pPr>
+        <w:pStyle w:val="Listeafsnit"/>
+        <w:numPr>
+          <w:ilvl w:val="0"/>
+          <w:numId w:val="3"/>
+        </w:numPr>
+      </w:pPr>
+      <w:r>
+        <w:t>Forberedelse</w:t>
+      </w:r>
+    </w:p>
+    <w:p>
+      <w:pPr>
+        <w:pStyle w:val="Listeafsnit"/>
+        <w:numPr>
+          <w:ilvl w:val="1"/>
+          <w:numId w:val="3"/>
+        </w:numPr>
+      </w:pPr>
+      <w:r>
+        <w:t>Læst op på materialet</w:t>
+      </w:r>
+      <w:r>
+        <w:t>/hjemmeopgaver</w:t>
+      </w:r>
+    </w:p>
+    <w:p>
+      <w:pPr>
+        <w:pStyle w:val="Listeafsnit"/>
+        <w:numPr>
+          <w:ilvl w:val="1"/>
+          <w:numId w:val="3"/>
+        </w:numPr>
+      </w:pPr>
+      <w:r>
+        <w:t>Skrevet et udkast til materialet</w:t>
+      </w:r>
+    </w:p>
+    <w:p>
+      <w:pPr>
+        <w:pStyle w:val="Listeafsnit"/>
+        <w:numPr>
+          <w:ilvl w:val="0"/>
+          <w:numId w:val="3"/>
+        </w:numPr>
+      </w:pPr>
+      <w:r>
+        <w:t>Til gruppemøderne</w:t>
+      </w:r>
+    </w:p>
+    <w:p>
+      <w:pPr>
+        <w:pStyle w:val="Listeafsnit"/>
+        <w:numPr>
+          <w:ilvl w:val="1"/>
+          <w:numId w:val="3"/>
+        </w:numPr>
+      </w:pPr>
+      <w:r>
+        <w:t>Feedback og evaluering af hjemmeopgaver</w:t>
+      </w:r>
+    </w:p>
+    <w:p>
+      <w:pPr>
+        <w:pStyle w:val="Listeafsnit"/>
+        <w:numPr>
+          <w:ilvl w:val="1"/>
+          <w:numId w:val="3"/>
+        </w:numPr>
+      </w:pPr>
+      <w:r>
+        <w:t>Planlægning af hvad der skal laves/læses som hjemmeopgaver til næste møde</w:t>
+      </w:r>
+    </w:p>
+    <w:p>
+      <w:pPr>
+        <w:pStyle w:val="Listeafsnit"/>
+        <w:numPr>
+          <w:ilvl w:val="1"/>
+          <w:numId w:val="3"/>
+        </w:numPr>
+      </w:pPr>
+      <w:r>
+        <w:t>Vurdering og diskussion af hvem der laver hvad, eventuelt om der skal være flere til at lave et enkelte element?</w:t>
+      </w:r>
+    </w:p>
+    <w:p>
+      <w:pPr>
+        <w:pStyle w:val="Listeafsnit"/>
+        <w:numPr>
+          <w:ilvl w:val="2"/>
+          <w:numId w:val="3"/>
+        </w:numPr>
+      </w:pPr>
+      <w:r>
+        <w:t>Sparringspartner til de forskellige delopgaver</w:t>
+      </w:r>
+    </w:p>
+    <w:p/>
     <w:p>
       <w:pPr>
         <w:pStyle w:val="Listeafsnit"/>
@@ -118,7 +523,7 @@
         </w:numPr>
       </w:pPr>
       <w:r>
-        <w:t>Arbejdstider</w:t>
+        <w:t>Fælles versus individuelt arbejde – hvor meget? – hvornår?</w:t>
       </w:r>
     </w:p>
     <w:p>
@@ -130,19 +535,7 @@
         </w:numPr>
       </w:pPr>
       <w:r>
-        <w:t xml:space="preserve">Tirsdag vejledningsmøde kl. 8:00 </w:t>
-      </w:r>
-      <w:r>
-        <w:t>–</w:t>
-      </w:r>
-      <w:r>
-        <w:t xml:space="preserve"> </w:t>
-      </w:r>
-      <w:r>
-        <w:t>8:45, herefter benytter vi vores sunde fornuft og arbejder ud fra hvor vi er i processen og omstændighederne. (Fleksibilitet</w:t>
-      </w:r>
-      <w:r>
-        <w:t>!)</w:t>
+        <w:t>Gruppearbejde starter som udgangspunkt sammen, herefter kan det dog opdeles eller fortsættes sammen.</w:t>
       </w:r>
     </w:p>
     <w:p>
@@ -154,7 +547,20 @@
         </w:numPr>
       </w:pPr>
       <w:r>
-        <w:t>”Onsdag inden forelæsning”</w:t>
+        <w:t>Individuelt arbejde fordeles fra gang til gang.</w:t>
+      </w:r>
+    </w:p>
+    <w:p/>
+    <w:p>
+      <w:pPr>
+        <w:pStyle w:val="Listeafsnit"/>
+        <w:numPr>
+          <w:ilvl w:val="1"/>
+          <w:numId w:val="1"/>
+        </w:numPr>
+      </w:pPr>
+      <w:r>
+        <w:t>Arbejdsdeling i forhold til skriftligt arbejde?</w:t>
       </w:r>
     </w:p>
     <w:p>
@@ -166,9 +572,10 @@
         </w:numPr>
       </w:pPr>
       <w:r>
-        <w:t>Torsdag 12 – 16 (15)</w:t>
-      </w:r>
-    </w:p>
+        <w:t>Opgaverne fordeles nogenlunde ligeligt mellem gruppensmedlemmer med feedback og evaluering af de forskellige afsnit til gruppemøder</w:t>
+      </w:r>
+    </w:p>
+    <w:p/>
     <w:p>
       <w:pPr>
         <w:pStyle w:val="Listeafsnit"/>
@@ -178,7 +585,7 @@
         </w:numPr>
       </w:pPr>
       <w:r>
-        <w:t>Gruppemøder</w:t>
+        <w:t>Vejledermøder – hvor tit? – Forberedelse?</w:t>
       </w:r>
     </w:p>
     <w:p>
@@ -190,7 +597,7 @@
         </w:numPr>
       </w:pPr>
       <w:r>
-        <w:t xml:space="preserve">Tirsdag og torsdag </w:t>
+        <w:t>Hver tirsdag kl. 8:00</w:t>
       </w:r>
     </w:p>
     <w:p>
@@ -202,7 +609,20 @@
         </w:numPr>
       </w:pPr>
       <w:r>
-        <w:t>Onsdag kan tages i brug ved relevans</w:t>
+        <w:t>Se vejledningsaftale for yderligere information</w:t>
+      </w:r>
+    </w:p>
+    <w:p/>
+    <w:p>
+      <w:pPr>
+        <w:pStyle w:val="Listeafsnit"/>
+        <w:numPr>
+          <w:ilvl w:val="1"/>
+          <w:numId w:val="1"/>
+        </w:numPr>
+      </w:pPr>
+      <w:r>
+        <w:t>Kursusdeltagelse og opgaveløsning – individuelt eller fælles?</w:t>
       </w:r>
     </w:p>
     <w:p>
@@ -214,7 +634,44 @@
         </w:numPr>
       </w:pPr>
       <w:r>
-        <w:t>Kommunikation i forhold til fravær og at komme for sent</w:t>
+        <w:t xml:space="preserve">Vi forventer at </w:t>
+      </w:r>
+      <w:r>
+        <w:t xml:space="preserve">alle </w:t>
+      </w:r>
+      <w:r>
+        <w:t xml:space="preserve">engagerer sig i hele uddannelsen, derved har alle de </w:t>
+      </w:r>
+      <w:r>
+        <w:t>forventede faglige kompetencer til projektet</w:t>
+      </w:r>
+    </w:p>
+    <w:p>
+      <w:pPr>
+        <w:pStyle w:val="Listeafsnit"/>
+        <w:numPr>
+          <w:ilvl w:val="1"/>
+          <w:numId w:val="3"/>
+        </w:numPr>
+      </w:pPr>
+      <w:r>
+        <w:t>Består de pointgivende aktiviteter</w:t>
+      </w:r>
+      <w:r>
+        <w:t xml:space="preserve"> i de sideløbende fag</w:t>
+      </w:r>
+    </w:p>
+    <w:p/>
+    <w:p>
+      <w:pPr>
+        <w:pStyle w:val="Listeafsnit"/>
+        <w:numPr>
+          <w:ilvl w:val="1"/>
+          <w:numId w:val="1"/>
+        </w:numPr>
+      </w:pPr>
+      <w:r>
+        <w:t>Deadlines</w:t>
       </w:r>
     </w:p>
     <w:p>
@@ -225,36 +682,6 @@
           <w:numId w:val="3"/>
         </w:numPr>
       </w:pPr>
-      <w:r>
-        <w:t>Forberedelse</w:t>
-      </w:r>
-    </w:p>
-    <w:p>
-      <w:pPr>
-        <w:pStyle w:val="Listeafsnit"/>
-        <w:numPr>
-          <w:ilvl w:val="1"/>
-          <w:numId w:val="3"/>
-        </w:numPr>
-      </w:pPr>
-      <w:r>
-        <w:t>Læst op på materialet</w:t>
-      </w:r>
-      <w:r>
-        <w:t>/hjemmeopgaver</w:t>
-      </w:r>
-    </w:p>
-    <w:p>
-      <w:pPr>
-        <w:pStyle w:val="Listeafsnit"/>
-        <w:numPr>
-          <w:ilvl w:val="1"/>
-          <w:numId w:val="3"/>
-        </w:numPr>
-      </w:pPr>
-      <w:r>
-        <w:t>Skrevet et udkast til materialet</w:t>
-      </w:r>
     </w:p>
     <w:p>
       <w:pPr>
@@ -265,57 +692,10 @@
         </w:numPr>
       </w:pPr>
       <w:r>
-        <w:t>Til gruppemøderne</w:t>
-      </w:r>
-    </w:p>
-    <w:p>
-      <w:pPr>
-        <w:pStyle w:val="Listeafsnit"/>
-        <w:numPr>
-          <w:ilvl w:val="1"/>
-          <w:numId w:val="3"/>
-        </w:numPr>
-      </w:pPr>
-      <w:r>
-        <w:t>Feedback og evaluering af hjemmeopgaver</w:t>
-      </w:r>
-    </w:p>
-    <w:p>
-      <w:pPr>
-        <w:pStyle w:val="Listeafsnit"/>
-        <w:numPr>
-          <w:ilvl w:val="1"/>
-          <w:numId w:val="3"/>
-        </w:numPr>
-      </w:pPr>
-      <w:r>
-        <w:t>Planlægning af hvad der skal laves/læses som hjemmeopgaver til næste møde</w:t>
-      </w:r>
-    </w:p>
-    <w:p>
-      <w:pPr>
-        <w:pStyle w:val="Listeafsnit"/>
-        <w:numPr>
-          <w:ilvl w:val="1"/>
-          <w:numId w:val="3"/>
-        </w:numPr>
-      </w:pPr>
-      <w:r>
-        <w:t>Vurdering og diskussion af hvem der laver hvad, eventuelt om der skal være flere til at lave et enkelte element?</w:t>
-      </w:r>
-    </w:p>
-    <w:p>
-      <w:pPr>
-        <w:pStyle w:val="Listeafsnit"/>
-        <w:numPr>
-          <w:ilvl w:val="2"/>
-          <w:numId w:val="3"/>
-        </w:numPr>
-      </w:pPr>
-      <w:r>
-        <w:t>Sparringspartner til de forskellige delopgaver</w:t>
-      </w:r>
-    </w:p>
+        <w:t>Uge 1 – 4: Eksamen</w:t>
+      </w:r>
+    </w:p>
+    <w:p/>
     <w:p>
       <w:pPr>
         <w:pStyle w:val="Listeafsnit"/>
@@ -325,7 +705,7 @@
         </w:numPr>
       </w:pPr>
       <w:r>
-        <w:t>Fælles versus individuelt arbejde – hvor meget? – hvornår?</w:t>
+        <w:t>Brug og revision af samarbejdsaftalen</w:t>
       </w:r>
     </w:p>
     <w:p>
@@ -337,163 +717,13 @@
         </w:numPr>
       </w:pPr>
       <w:r>
-        <w:t>Gruppearbejde starter som udgangspunkt sammen, herefter kan det dog opdeles eller fortsættes sammen.</w:t>
-      </w:r>
-    </w:p>
-    <w:p>
-      <w:pPr>
-        <w:pStyle w:val="Listeafsnit"/>
-        <w:numPr>
-          <w:ilvl w:val="0"/>
-          <w:numId w:val="3"/>
-        </w:numPr>
-      </w:pPr>
-      <w:r>
-        <w:t>Individuelt arbejde fordeles fra gang til gang.</w:t>
-      </w:r>
-    </w:p>
-    <w:p>
-      <w:pPr>
-        <w:pStyle w:val="Listeafsnit"/>
-        <w:numPr>
-          <w:ilvl w:val="1"/>
-          <w:numId w:val="1"/>
-        </w:numPr>
-      </w:pPr>
-      <w:r>
-        <w:t>Arbejdsdeling i forhold til skriftligt arbejde?</w:t>
-      </w:r>
-    </w:p>
-    <w:p>
-      <w:pPr>
-        <w:pStyle w:val="Listeafsnit"/>
-        <w:numPr>
-          <w:ilvl w:val="0"/>
-          <w:numId w:val="3"/>
-        </w:numPr>
-      </w:pPr>
-      <w:r>
-        <w:t>Opgaverne fordeles nogenlunde ligeligt mellem gruppensmedlemmer med feedback og evaluering af de forskellige afsnit til gruppemøder</w:t>
-      </w:r>
-    </w:p>
-    <w:p>
-      <w:pPr>
-        <w:pStyle w:val="Listeafsnit"/>
-        <w:numPr>
-          <w:ilvl w:val="1"/>
-          <w:numId w:val="1"/>
-        </w:numPr>
-      </w:pPr>
-      <w:r>
-        <w:t>Vejledermøder – hvor tit? – Forberedelse?</w:t>
-      </w:r>
-    </w:p>
-    <w:p>
-      <w:pPr>
-        <w:pStyle w:val="Listeafsnit"/>
-        <w:numPr>
-          <w:ilvl w:val="0"/>
-          <w:numId w:val="3"/>
-        </w:numPr>
-      </w:pPr>
-      <w:r>
-        <w:t>Hver tirsdag kl. 8:00</w:t>
-      </w:r>
-    </w:p>
-    <w:p>
-      <w:pPr>
-        <w:pStyle w:val="Listeafsnit"/>
-        <w:numPr>
-          <w:ilvl w:val="1"/>
-          <w:numId w:val="1"/>
-        </w:numPr>
-      </w:pPr>
-      <w:r>
-        <w:t>Kursusdeltagelse og opgaveløsning – individuelt eller fælles?</w:t>
-      </w:r>
-    </w:p>
-    <w:p>
-      <w:pPr>
-        <w:pStyle w:val="Listeafsnit"/>
-        <w:numPr>
-          <w:ilvl w:val="0"/>
-          <w:numId w:val="3"/>
-        </w:numPr>
-      </w:pPr>
-      <w:r>
-        <w:t xml:space="preserve">Vi forventer at </w:t>
-      </w:r>
-      <w:r>
-        <w:t xml:space="preserve">alle </w:t>
-      </w:r>
-      <w:r>
-        <w:t xml:space="preserve">engagerer sig i hele uddannelsen, derved har alle de </w:t>
-      </w:r>
-      <w:r>
-        <w:t>forventede faglige kompetencer til projektet</w:t>
-      </w:r>
-    </w:p>
-    <w:p>
-      <w:pPr>
-        <w:pStyle w:val="Listeafsnit"/>
-        <w:numPr>
-          <w:ilvl w:val="1"/>
-          <w:numId w:val="1"/>
-        </w:numPr>
-      </w:pPr>
-      <w:r>
-        <w:lastRenderedPageBreak/>
-        <w:t>Deadlines</w:t>
-      </w:r>
-    </w:p>
-    <w:p>
-      <w:pPr>
-        <w:pStyle w:val="Listeafsnit"/>
-        <w:numPr>
-          <w:ilvl w:val="0"/>
-          <w:numId w:val="3"/>
-        </w:numPr>
-      </w:pPr>
-    </w:p>
-    <w:p>
-      <w:pPr>
-        <w:pStyle w:val="Listeafsnit"/>
-        <w:numPr>
-          <w:ilvl w:val="0"/>
-          <w:numId w:val="3"/>
-        </w:numPr>
-      </w:pPr>
-      <w:r>
-        <w:t>Uge 1 – 4: Eksamen</w:t>
-      </w:r>
-    </w:p>
-    <w:p>
-      <w:pPr>
-        <w:pStyle w:val="Listeafsnit"/>
-        <w:numPr>
-          <w:ilvl w:val="1"/>
-          <w:numId w:val="1"/>
-        </w:numPr>
-      </w:pPr>
-      <w:r>
-        <w:t>Brug og revision af samarbejdsaftalen</w:t>
-      </w:r>
-    </w:p>
-    <w:p>
-      <w:pPr>
-        <w:pStyle w:val="Listeafsnit"/>
-        <w:numPr>
-          <w:ilvl w:val="0"/>
-          <w:numId w:val="3"/>
-        </w:numPr>
-      </w:pPr>
-      <w:r>
         <w:t xml:space="preserve">Samarbejdsaftalen er et udgangspunkt til at holde hinanden oppe på arbejdsindsats og at være en del af processen, dog er det et dynamisk dokument som rettes til </w:t>
       </w:r>
       <w:r>
         <w:t>efter omstændighederne.</w:t>
       </w:r>
     </w:p>
+    <w:p/>
     <w:p>
       <w:pPr>
         <w:pStyle w:val="Listeafsnit"/>
@@ -678,7 +908,47 @@
         <w:t>50161323</w:t>
       </w:r>
     </w:p>
-    <w:p/>
+    <w:p>
+      <w:pPr>
+        <w:pStyle w:val="Listeafsnit"/>
+        <w:numPr>
+          <w:ilvl w:val="0"/>
+          <w:numId w:val="3"/>
+        </w:numPr>
+      </w:pPr>
+      <w:r>
+        <w:t>Mathias Foged</w:t>
+      </w:r>
+    </w:p>
+    <w:p>
+      <w:pPr>
+        <w:pStyle w:val="Listeafsnit"/>
+        <w:numPr>
+          <w:ilvl w:val="1"/>
+          <w:numId w:val="3"/>
+        </w:numPr>
+      </w:pPr>
+      <w:hyperlink r:id="rId9" w:history="1">
+        <w:r>
+          <w:rPr>
+            <w:rStyle w:val="Hyperlink"/>
+          </w:rPr>
+          <w:t>Maha816@student.sdu.dk</w:t>
+        </w:r>
+      </w:hyperlink>
+    </w:p>
+    <w:p>
+      <w:pPr>
+        <w:pStyle w:val="Listeafsnit"/>
+        <w:numPr>
+          <w:ilvl w:val="1"/>
+          <w:numId w:val="3"/>
+        </w:numPr>
+      </w:pPr>
+      <w:r>
+        <w:t>51334488</w:t>
+      </w:r>
+    </w:p>
     <w:p>
       <w:r>
         <w:t>Vejleder</w:t>
@@ -711,7 +981,7 @@
           <w:szCs w:val="28"/>
         </w:rPr>
       </w:pPr>
-      <w:hyperlink r:id="rId9" w:history="1">
+      <w:hyperlink r:id="rId10" w:history="1">
         <w:r>
           <w:rPr>
             <w:rStyle w:val="Hyperlink"/>

</xml_diff>